<commit_message>
Update technical documentation for artist schema
Regenerates the ERD and UML to include the artist detail fields (career_highlights, tracks, audio_url, image) and the artist_images gallery table.
</commit_message>
<xml_diff>
--- a/docs/Technical-Documentation.docx
+++ b/docs/Technical-Documentation.docx
@@ -136,7 +136,7 @@
       <w:r>
         <w:drawing>
           <wp:inline xmlns:a="http://schemas.openxmlformats.org/drawingml/2006/main" xmlns:pic="http://schemas.openxmlformats.org/drawingml/2006/picture">
-            <wp:extent cx="5943600" cy="5584612"/>
+            <wp:extent cx="5943600" cy="4941554"/>
             <wp:docPr id="2" name="Picture 2"/>
             <wp:cNvGraphicFramePr>
               <a:graphicFrameLocks noChangeAspect="1"/>
@@ -157,7 +157,7 @@
                   <pic:spPr>
                     <a:xfrm>
                       <a:off x="0" y="0"/>
-                      <a:ext cx="5943600" cy="5584612"/>
+                      <a:ext cx="5943600" cy="4941554"/>
                     </a:xfrm>
                     <a:prstGeom prst="rect"/>
                   </pic:spPr>
@@ -328,7 +328,29 @@
           </w:tcPr>
           <w:p>
             <w:r>
-              <w:t>Catalogue entities; artists link to events many-to-many.</w:t>
+              <w:t>Catalogue entities; artists link to events many-to-many and have detail content.</w:t>
+            </w:r>
+          </w:p>
+        </w:tc>
+      </w:tr>
+      <w:tr>
+        <w:tc>
+          <w:tcPr>
+            <w:tcW w:type="dxa" w:w="4320"/>
+          </w:tcPr>
+          <w:p>
+            <w:r>
+              <w:t>artist_images</w:t>
+            </w:r>
+          </w:p>
+        </w:tc>
+        <w:tc>
+          <w:tcPr>
+            <w:tcW w:type="dxa" w:w="4320"/>
+          </w:tcPr>
+          <w:p>
+            <w:r>
+              <w:t>Gallery images for an artist's detail page.</w:t>
             </w:r>
           </w:p>
         </w:tc>
@@ -439,7 +461,7 @@
       <w:r>
         <w:drawing>
           <wp:inline xmlns:a="http://schemas.openxmlformats.org/drawingml/2006/main" xmlns:pic="http://schemas.openxmlformats.org/drawingml/2006/picture">
-            <wp:extent cx="5943600" cy="4376686"/>
+            <wp:extent cx="5943600" cy="4160520"/>
             <wp:docPr id="3" name="Picture 3"/>
             <wp:cNvGraphicFramePr>
               <a:graphicFrameLocks noChangeAspect="1"/>
@@ -460,7 +482,7 @@
                   <pic:spPr>
                     <a:xfrm>
                       <a:off x="0" y="0"/>
-                      <a:ext cx="5943600" cy="4376686"/>
+                      <a:ext cx="5943600" cy="4160520"/>
                     </a:xfrm>
                     <a:prstGeom prst="rect"/>
                   </pic:spPr>

</xml_diff>